<commit_message>
feat: generate IEEE-formatted RSL research article and figures for introduction, methodology, and results
</commit_message>
<xml_diff>
--- a/project/introduccion/Introduccion_RSL.docx
+++ b/project/introduccion/Introduccion_RSL.docx
@@ -73,22 +73,9 @@
         </w:sectPr>
       </w:pPr>
       <w:r>
-        <w:rPr>
-          <w:rFonts w:ascii="Times New Roman" w:cs="Times New Roman" w:eastAsia="Times New Roman" w:hAnsi="Times New Roman"/>
-          <w:i w:val="1"/>
-          <w:iCs w:val="1"/>
-          <w:sz w:val="19"/>
-          <w:szCs w:val="19"/>
-          <w:rtl w:val="0"/>
-        </w:rPr>
-        <w:t xml:space="preserve">Rupay Sergio y Gallegos Rodrigo, Facultad de Ingeniería de Sistemas y Informática, Universidad Tecnológica del Perú, Lima, Perú</w:t>
-        <w:br w:type="textWrapping"/>
+        <w:t>Rupay Huancachoque Sergio André, Facultad de Ingeniería de Sistemas y Informática, Universidad Tecnológica del Perú, Lima, Perú</w:t>
+        <w:br/>
         <w:t xml:space="preserve"> Docente: Jimmy Sánchez Portugal </w:t>
-      </w:r>
-      <w:r>
-        <w:rPr>
-          <w:rtl w:val="0"/>
-        </w:rPr>
       </w:r>
     </w:p>
     <w:p>

</xml_diff>